<commit_message>
added dashbaord to project
</commit_message>
<xml_diff>
--- a/Movie Data Analysis Project.docx
+++ b/Movie Data Analysis Project.docx
@@ -36,22 +36,7 @@
         <w:ind w:firstLine="720"/>
       </w:pPr>
       <w:r>
-        <w:t xml:space="preserve">Hello everybody, the following is a project to practice even more on my data analysis skills. Unlike my previous project on used car data this one is based on movie data </w:t>
-      </w:r>
-      <w:r>
-        <w:t>from</w:t>
-      </w:r>
-      <w:r>
-        <w:t xml:space="preserve"> 1980 through 1991. In this project I wanted to learn about more complex SQL problems and wanted to include the use of </w:t>
-      </w:r>
-      <w:r>
-        <w:t>CTE</w:t>
-      </w:r>
-      <w:r>
-        <w:t>s in some solutions. Below I  provided the data and what it includes</w:t>
-      </w:r>
-      <w:r>
-        <w:t>.</w:t>
+        <w:t>Welcome to my SQL-based Movie Data Analysis Project, where I explore and strengthen my data analysis skills using a dataset of films released between 1980 and 1991. Building on the foundation of my previous project on used car data, this analysis dives deeper into complex SQL concepts, including the use of Common Table Expressions (CTEs) and advanced filtering. By examining various aspects such as profitability, ratings, production companies, and international performance, this project showcases how data can reveal hidden trends and surprising insights within the film industry. The dataset, sourced from Kaggle, serves as a rich resource to uncover patterns that shaped a decade of cinema.</w:t>
       </w:r>
     </w:p>
     <w:tbl>
@@ -103,28 +88,35 @@
     <w:p>
       <w:pPr>
         <w:spacing w:before="240" w:after="0"/>
-      </w:pPr>
-      <w:r>
-        <w:t xml:space="preserve">The data was retrieved </w:t>
-      </w:r>
-      <w:r>
-        <w:t>from</w:t>
-      </w:r>
+        <w:ind w:firstLine="720"/>
+      </w:pPr>
+      <w:r>
+        <w:t>The dataset used in this project was sourced from Kaggle and includes a wide range of information on movies released between 1980 and 1991. It contains key variables such as film titles, release years, production companies, countries, genres, budgets, gross earnings, number of votes, and viewer scores. This comprehensive dataset provides an excellent foundation for exploring trends in film profitability, audience reception, and production patterns during this iconic era in cinema history. The rich variety of features allows for detailed analysis using SQL, making it ideal for developing more advanced querying techniques and insights. The data was retrieved from Kaggle and includes the following variables:</w:t>
+      </w:r>
+    </w:p>
+    <w:p>
+      <w:r>
+        <w:t xml:space="preserve">You can access the data page from </w:t>
+      </w:r>
+      <w:r>
+        <w:t>K</w:t>
+      </w:r>
+      <w:r>
+        <w:t xml:space="preserve">aggle using the following link - </w:t>
+      </w:r>
+    </w:p>
+    <w:p>
+      <w:hyperlink r:id="rId5" w:history="1">
+        <w:r>
+          <w:rPr>
+            <w:rStyle w:val="Hyperlink"/>
+          </w:rPr>
+          <w:t>https://www.kaggle.com/datasets/danielgrijalvas/movies/data</w:t>
+        </w:r>
+      </w:hyperlink>
       <w:r>
         <w:t xml:space="preserve"> </w:t>
       </w:r>
-      <w:r>
-        <w:t>K</w:t>
-      </w:r>
-      <w:r>
-        <w:t>aggle and includes the following variables:</w:t>
-      </w:r>
-    </w:p>
-    <w:p>
-      <w:pPr>
-        <w:spacing w:before="240" w:after="0"/>
-        <w:ind w:firstLine="720"/>
-      </w:pPr>
     </w:p>
     <w:p>
       <w:pPr>
@@ -135,10 +127,10 @@
           <w:noProof/>
         </w:rPr>
         <w:drawing>
-          <wp:inline distT="0" distB="0" distL="0" distR="0" wp14:anchorId="1A7858DA" wp14:editId="6BC26AE2">
-            <wp:extent cx="1981200" cy="3060965"/>
-            <wp:effectExtent l="0" t="0" r="0" b="6350"/>
-            <wp:docPr id="1930925975" name="Picture 2" descr="A screenshot of a phone&#10;&#10;AI-generated content may be incorrect."/>
+          <wp:inline distT="0" distB="0" distL="0" distR="0" wp14:anchorId="21C5D8A5" wp14:editId="28CB4E25">
+            <wp:extent cx="1304925" cy="3393565"/>
+            <wp:effectExtent l="0" t="0" r="0" b="0"/>
+            <wp:docPr id="412760321" name="Picture 1" descr="A screenshot of a phone&#10;&#10;AI-generated content may be incorrect."/>
             <wp:cNvGraphicFramePr>
               <a:graphicFrameLocks xmlns:a="http://schemas.openxmlformats.org/drawingml/2006/main" noChangeAspect="1"/>
             </wp:cNvGraphicFramePr>
@@ -146,31 +138,22 @@
               <a:graphicData uri="http://schemas.openxmlformats.org/drawingml/2006/picture">
                 <pic:pic xmlns:pic="http://schemas.openxmlformats.org/drawingml/2006/picture">
                   <pic:nvPicPr>
-                    <pic:cNvPr id="1930925975" name="Picture 2" descr="A screenshot of a phone&#10;&#10;AI-generated content may be incorrect."/>
-                    <pic:cNvPicPr>
-                      <a:picLocks noChangeAspect="1" noChangeArrowheads="1"/>
-                    </pic:cNvPicPr>
+                    <pic:cNvPr id="412760321" name="Picture 1" descr="A screenshot of a phone&#10;&#10;AI-generated content may be incorrect."/>
+                    <pic:cNvPicPr/>
                   </pic:nvPicPr>
                   <pic:blipFill rotWithShape="1">
-                    <a:blip r:embed="rId5">
-                      <a:extLst>
-                        <a:ext uri="{28A0092B-C50C-407E-A947-70E740481C1C}">
-                          <a14:useLocalDpi xmlns:a14="http://schemas.microsoft.com/office/drawing/2010/main" val="0"/>
-                        </a:ext>
-                      </a:extLst>
-                    </a:blip>
-                    <a:srcRect l="13403" t="10619" r="3288" b="5391"/>
+                    <a:blip r:embed="rId6"/>
+                    <a:srcRect l="3227" t="965" r="3981" b="3055"/>
                     <a:stretch/>
                   </pic:blipFill>
                   <pic:spPr bwMode="auto">
                     <a:xfrm>
                       <a:off x="0" y="0"/>
-                      <a:ext cx="2031749" cy="3139064"/>
+                      <a:ext cx="1336926" cy="3476785"/>
                     </a:xfrm>
                     <a:prstGeom prst="rect">
                       <a:avLst/>
                     </a:prstGeom>
-                    <a:noFill/>
                     <a:ln>
                       <a:noFill/>
                     </a:ln>
@@ -186,32 +169,6 @@
           </wp:inline>
         </w:drawing>
       </w:r>
-    </w:p>
-    <w:p>
-      <w:r>
-        <w:t xml:space="preserve">You can access the data page from </w:t>
-      </w:r>
-      <w:r>
-        <w:t>K</w:t>
-      </w:r>
-      <w:r>
-        <w:t xml:space="preserve">aggle using the following link - </w:t>
-      </w:r>
-    </w:p>
-    <w:p>
-      <w:hyperlink r:id="rId6" w:history="1">
-        <w:r>
-          <w:rPr>
-            <w:rStyle w:val="Hyperlink"/>
-          </w:rPr>
-          <w:t>https://www.kaggle.com/datasets/danielgrijalvas/movies/data</w:t>
-        </w:r>
-      </w:hyperlink>
-      <w:r>
-        <w:t xml:space="preserve"> </w:t>
-      </w:r>
-    </w:p>
-    <w:p>
       <w:r>
         <w:br w:type="page"/>
       </w:r>
@@ -492,9 +449,14 @@
         </w:numPr>
         <w:spacing w:before="240"/>
       </w:pPr>
+      <w:proofErr w:type="gramStart"/>
       <w:r>
         <w:lastRenderedPageBreak/>
-        <w:t>List all companies that have produced more than 10 movies and have an average gross over $50 million.</w:t>
+        <w:t>List</w:t>
+      </w:r>
+      <w:proofErr w:type="gramEnd"/>
+      <w:r>
+        <w:t xml:space="preserve"> all companies that have produced more than 10 movies and have an average gross over $50 million.</w:t>
       </w:r>
     </w:p>
     <w:p>
@@ -566,7 +528,15 @@
         </w:numPr>
       </w:pPr>
       <w:r>
-        <w:t>I decided to order it by profit to show the most profitable studio with more than 10 films</w:t>
+        <w:t xml:space="preserve">I decided to order it </w:t>
+      </w:r>
+      <w:proofErr w:type="gramStart"/>
+      <w:r>
+        <w:t>by</w:t>
+      </w:r>
+      <w:proofErr w:type="gramEnd"/>
+      <w:r>
+        <w:t xml:space="preserve"> profit to show the most profitable studio with more than 10 films</w:t>
       </w:r>
     </w:p>
     <w:p>
@@ -1504,6 +1474,7 @@
         <w:t>From the results above we can determine that Universal Pictures E.T. is the most profitable studio move from Universal Pictures with a profit of $782,410,554. Behind is Star Wars: Episode 5 from Lucasfilm with a profit of $520,375,067. And, lastly in 3rd is Ghost from Paramount Pictures with a profit of $483,703,557</w:t>
       </w:r>
     </w:p>
+    <w:p/>
     <w:p>
       <w:pPr>
         <w:pStyle w:val="ListParagraph"/>
@@ -1901,6 +1872,7 @@
     <w:p/>
     <w:p/>
     <w:p/>
+    <w:p/>
     <w:p>
       <w:pPr>
         <w:pStyle w:val="ListParagraph"/>
@@ -1993,7 +1965,15 @@
         </w:numPr>
       </w:pPr>
       <w:r>
-        <w:t>We then join both CTEs on the conditions that the months are the same and that the profit equals the max profit</w:t>
+        <w:t xml:space="preserve">We then join both CTEs on the </w:t>
+      </w:r>
+      <w:proofErr w:type="gramStart"/>
+      <w:r>
+        <w:t>conditions</w:t>
+      </w:r>
+      <w:proofErr w:type="gramEnd"/>
+      <w:r>
+        <w:t xml:space="preserve"> that the months are the same and that the profit equals the max profit</w:t>
       </w:r>
     </w:p>
     <w:p>
@@ -2069,12 +2049,12 @@
         <w:spacing w:before="240" w:after="0"/>
       </w:pPr>
       <w:r>
+        <w:t>Result:</w:t>
+      </w:r>
+    </w:p>
+    <w:p>
+      <w:r>
         <w:lastRenderedPageBreak/>
-        <w:t>Result:</w:t>
-      </w:r>
-    </w:p>
-    <w:p>
-      <w:r>
         <w:t xml:space="preserve"> </w:t>
       </w:r>
       <w:r>
@@ -2231,7 +2211,15 @@
         </w:numPr>
       </w:pPr>
       <w:r>
-        <w:t>The second CTE find the max profitable film from each region using the previous CTE.</w:t>
+        <w:t xml:space="preserve">The second CTE </w:t>
+      </w:r>
+      <w:proofErr w:type="gramStart"/>
+      <w:r>
+        <w:t>find</w:t>
+      </w:r>
+      <w:proofErr w:type="gramEnd"/>
+      <w:r>
+        <w:t xml:space="preserve"> the max profitable film from each region using the previous CTE.</w:t>
       </w:r>
     </w:p>
     <w:p>
@@ -2421,7 +2409,7 @@
     </w:p>
     <w:sectPr>
       <w:pgSz w:w="12240" w:h="15840"/>
-      <w:pgMar w:top="810" w:right="1440" w:bottom="1440" w:left="1440" w:header="720" w:footer="720" w:gutter="0"/>
+      <w:pgMar w:top="810" w:right="1440" w:bottom="810" w:left="1440" w:header="720" w:footer="720" w:gutter="0"/>
       <w:cols w:space="720"/>
       <w:docGrid w:linePitch="360"/>
     </w:sectPr>
@@ -4879,7 +4867,7 @@
   <w:style w:type="paragraph" w:default="1" w:styleId="Normal">
     <w:name w:val="Normal"/>
     <w:qFormat/>
-    <w:rsid w:val="00A7549B"/>
+    <w:rsid w:val="008213A3"/>
   </w:style>
   <w:style w:type="paragraph" w:styleId="Heading1">
     <w:name w:val="heading 1"/>
@@ -5083,7 +5071,6 @@
   <w:style w:type="character" w:default="1" w:styleId="DefaultParagraphFont">
     <w:name w:val="Default Paragraph Font"/>
     <w:uiPriority w:val="1"/>
-    <w:semiHidden/>
     <w:unhideWhenUsed/>
   </w:style>
   <w:style w:type="table" w:default="1" w:styleId="TableNormal">

</xml_diff>